<commit_message>
feat(crisis-radar): add official HKMA news channel
</commit_message>
<xml_diff>
--- a/docs/Crisis_Radar_Руководство_и_методика.docx
+++ b/docs/Crisis_Radar_Руководство_и_методика.docx
@@ -6540,7 +6540,94 @@
           <w:rFonts w:ascii="Calibri" w:hAnsi="Calibri" w:eastAsia="Calibri"/>
           <w:sz w:val="22"/>
         </w:rPr>
-        <w:t>Official-first feeds: Fed, ECB, SEC, CFTC, BIS, BOJ, RBI, BoE, BoC и FDIC. GDELT используется только для discovery. Оригинальный язык и текст сохраняются; перевод производный. Dedupe, URL allowlist, bounded payload, XML hardening и prompt-like text defence применяются до извлечения событий.</w:t>
+        <w:t>Official-first feeds: Fed, ECB, SEC, CFTC, BIS, BOJ, RBI, BoE, BoC, FDIC и HKMA. Первые десять источников используют официальные RSS; HKMA подключён через официальный JSON API пресс-релизов и даёт отдельный банковский и ликвидностный контур Hong Kong/Greater China. GDELT используется только для discovery. Оригинальный язык и текст сохраняются; перевод производный. Dedupe, URL allowlist, bounded payload, XML/JSON hardening и prompt-like text defence применяются до извлечения событий.</w:t>
+      </w:r>
+    </w:p>
+    <w:p>
+      <w:pPr>
+        <w:jc w:val="left"/>
+      </w:pPr>
+      <w:r>
+        <w:rPr>
+          <w:rFonts w:ascii="Calibri" w:hAnsi="Calibri" w:eastAsia="Calibri"/>
+          <w:sz w:val="22"/>
+        </w:rPr>
+        <w:t xml:space="preserve">Каждый источник имеет отдельный health status. В HKMA-парсере обязательны </w:t>
+      </w:r>
+      <w:r>
+        <w:rPr>
+          <w:rFonts w:ascii="Courier New" w:hAnsi="Courier New" w:eastAsia="Courier New"/>
+          <w:color w:val="1F4D78"/>
+          <w:sz w:val="20"/>
+        </w:rPr>
+        <w:t>success=true</w:t>
+      </w:r>
+      <w:r>
+        <w:rPr>
+          <w:rFonts w:ascii="Calibri" w:hAnsi="Calibri" w:eastAsia="Calibri"/>
+          <w:sz w:val="22"/>
+        </w:rPr>
+        <w:t xml:space="preserve">, </w:t>
+      </w:r>
+      <w:r>
+        <w:rPr>
+          <w:rFonts w:ascii="Courier New" w:hAnsi="Courier New" w:eastAsia="Courier New"/>
+          <w:color w:val="1F4D78"/>
+          <w:sz w:val="20"/>
+        </w:rPr>
+        <w:t>err_code=0000</w:t>
+      </w:r>
+      <w:r>
+        <w:rPr>
+          <w:rFonts w:ascii="Calibri" w:hAnsi="Calibri" w:eastAsia="Calibri"/>
+          <w:sz w:val="22"/>
+        </w:rPr>
+        <w:t xml:space="preserve">, согласованный </w:t>
+      </w:r>
+      <w:r>
+        <w:rPr>
+          <w:rFonts w:ascii="Courier New" w:hAnsi="Courier New" w:eastAsia="Courier New"/>
+          <w:color w:val="1F4D78"/>
+          <w:sz w:val="20"/>
+        </w:rPr>
+        <w:t>datasize</w:t>
+      </w:r>
+      <w:r>
+        <w:rPr>
+          <w:rFonts w:ascii="Calibri" w:hAnsi="Calibri" w:eastAsia="Calibri"/>
+          <w:sz w:val="22"/>
+        </w:rPr>
+        <w:t xml:space="preserve">, 1–100 записей, дата </w:t>
+      </w:r>
+      <w:r>
+        <w:rPr>
+          <w:rFonts w:ascii="Courier New" w:hAnsi="Courier New" w:eastAsia="Courier New"/>
+          <w:color w:val="1F4D78"/>
+          <w:sz w:val="20"/>
+        </w:rPr>
+        <w:t>YYYY-MM-DD</w:t>
+      </w:r>
+      <w:r>
+        <w:rPr>
+          <w:rFonts w:ascii="Calibri" w:hAnsi="Calibri" w:eastAsia="Calibri"/>
+          <w:sz w:val="22"/>
+        </w:rPr>
+        <w:t xml:space="preserve"> и ссылка только на </w:t>
+      </w:r>
+      <w:r>
+        <w:rPr>
+          <w:rFonts w:ascii="Courier New" w:hAnsi="Courier New" w:eastAsia="Courier New"/>
+          <w:color w:val="1F4D78"/>
+          <w:sz w:val="20"/>
+        </w:rPr>
+        <w:t>www.hkma.gov.hk</w:t>
+      </w:r>
+      <w:r>
+        <w:rPr>
+          <w:rFonts w:ascii="Calibri" w:hAnsi="Calibri" w:eastAsia="Calibri"/>
+          <w:sz w:val="22"/>
+        </w:rPr>
+        <w:t>. Неуспешный ответ, подмена домена, дубликаты, некорректная схема и публикации из будущего не попадают в память доказательств. Успешная live-проверка 11 августа 2026 года подтвердила 11 из 11 настроенных официальных новостных каналов; это проверка доступности и контракта, а не доказательство полноты всех мировых событий.</w:t>
       </w:r>
     </w:p>
     <w:tbl>

</xml_diff>

<commit_message>
feat(crisis-radar): add official OFAC sanctions feed
</commit_message>
<xml_diff>
--- a/docs/Crisis_Radar_Руководство_и_методика.docx
+++ b/docs/Crisis_Radar_Руководство_и_методика.docx
@@ -6540,7 +6540,22 @@
           <w:rFonts w:ascii="Calibri" w:hAnsi="Calibri" w:eastAsia="Calibri"/>
           <w:sz w:val="22"/>
         </w:rPr>
-        <w:t>Official-first feeds: Fed, ECB, SEC, CFTC, BIS, BOJ, RBI, BoE, BoC, FDIC и HKMA. Первые десять источников используют официальные RSS; HKMA подключён через официальный JSON API пресс-релизов и даёт отдельный банковский и ликвидностный контур Hong Kong/Greater China. GDELT используется только для discovery. Оригинальный язык и текст сохраняются; перевод производный. Dedupe, URL allowlist, bounded payload, XML/JSON hardening и prompt-like text defence применяются до извлечения событий.</w:t>
+        <w:t xml:space="preserve">Official-first feeds: Fed, ECB, SEC, CFTC, BIS, BOJ, RBI, BoE, BoC, FDIC, HKMA и OFAC. Десять источников используют официальные RSS; HKMA подключён через официальный JSON API пресс-релизов и даёт отдельный банковский и ликвидностный контур Hong Kong/Greater China. OFAC использует публичный GovDelivery RSS темы официальной e-mail-подписки </w:t>
+      </w:r>
+      <w:r>
+        <w:rPr>
+          <w:rFonts w:ascii="Courier New" w:hAnsi="Courier New" w:eastAsia="Courier New"/>
+          <w:color w:val="1F4D78"/>
+          <w:sz w:val="20"/>
+        </w:rPr>
+        <w:t>USTREAS_61</w:t>
+      </w:r>
+      <w:r>
+        <w:rPr>
+          <w:rFonts w:ascii="Calibri" w:hAnsi="Calibri" w:eastAsia="Calibri"/>
+          <w:sz w:val="22"/>
+        </w:rPr>
+        <w:t xml:space="preserve"> и формирует санкционный event-контур. Старый собственный OFAC RSS, официально закрытый в 2025 году, не используется. GDELT используется только для discovery. Оригинальный язык и текст сохраняются; перевод производный. Dedupe, URL allowlist, bounded payload, XML/JSON hardening и prompt-like text defence применяются до извлечения событий.</w:t>
       </w:r>
     </w:p>
     <w:p>
@@ -6627,7 +6642,52 @@
           <w:rFonts w:ascii="Calibri" w:hAnsi="Calibri" w:eastAsia="Calibri"/>
           <w:sz w:val="22"/>
         </w:rPr>
-        <w:t>. Неуспешный ответ, подмена домена, дубликаты, некорректная схема и публикации из будущего не попадают в память доказательств. Успешная live-проверка 11 августа 2026 года подтвердила 11 из 11 настроенных официальных новостных каналов; это проверка доступности и контракта, а не доказательство полноты всех мировых событий.</w:t>
+        <w:t xml:space="preserve">. Неуспешный ответ, подмена домена, дубликаты, некорректная схема и публикации из будущего не попадают в память доказательств. OFAC-канал принимает ссылки только с </w:t>
+      </w:r>
+      <w:r>
+        <w:rPr>
+          <w:rFonts w:ascii="Courier New" w:hAnsi="Courier New" w:eastAsia="Courier New"/>
+          <w:color w:val="1F4D78"/>
+          <w:sz w:val="20"/>
+        </w:rPr>
+        <w:t>ofac.treasury.gov</w:t>
+      </w:r>
+      <w:r>
+        <w:rPr>
+          <w:rFonts w:ascii="Calibri" w:hAnsi="Calibri" w:eastAsia="Calibri"/>
+          <w:sz w:val="22"/>
+        </w:rPr>
+        <w:t xml:space="preserve">, </w:t>
+      </w:r>
+      <w:r>
+        <w:rPr>
+          <w:rFonts w:ascii="Courier New" w:hAnsi="Courier New" w:eastAsia="Courier New"/>
+          <w:color w:val="1F4D78"/>
+          <w:sz w:val="20"/>
+        </w:rPr>
+        <w:t>public.govdelivery.com</w:t>
+      </w:r>
+      <w:r>
+        <w:rPr>
+          <w:rFonts w:ascii="Calibri" w:hAnsi="Calibri" w:eastAsia="Calibri"/>
+          <w:sz w:val="22"/>
+        </w:rPr>
+        <w:t xml:space="preserve"> и </w:t>
+      </w:r>
+      <w:r>
+        <w:rPr>
+          <w:rFonts w:ascii="Courier New" w:hAnsi="Courier New" w:eastAsia="Courier New"/>
+          <w:color w:val="1F4D78"/>
+          <w:sz w:val="20"/>
+        </w:rPr>
+        <w:t>content.govdelivery.com</w:t>
+      </w:r>
+      <w:r>
+        <w:rPr>
+          <w:rFonts w:ascii="Calibri" w:hAnsi="Calibri" w:eastAsia="Calibri"/>
+          <w:sz w:val="22"/>
+        </w:rPr>
+        <w:t>. Успешная live-проверка 11 августа 2026 года подтвердила 12 из 12 настроенных официальных новостных каналов; это проверка доступности и контракта, а не доказательство полноты всех мировых событий.</w:t>
       </w:r>
     </w:p>
     <w:tbl>

</xml_diff>